<commit_message>
feat: TP1 with all questions answered, except for question two.
</commit_message>
<xml_diff>
--- a/TP1/documentos/samuel_hermany_DR1_TP1.docx
+++ b/TP1/documentos/samuel_hermany_DR1_TP1.docx
@@ -30,7 +30,7 @@
       <w:sdtContent>
         <w:p>
           <w:pPr>
-            <w:pStyle w:val="19"/>
+            <w:pStyle w:val="21"/>
           </w:pPr>
           <w:r>
             <mc:AlternateContent>
@@ -289,7 +289,7 @@
                                   <w:sdtContent>
                                     <w:p>
                                       <w:pPr>
-                                        <w:pStyle w:val="19"/>
+                                        <w:pStyle w:val="21"/>
                                         <w:jc w:val="right"/>
                                         <w:rPr>
                                           <w:color w:val="FFFFFF" w:themeColor="background1"/>
@@ -3441,7 +3441,7 @@
                             <w:sdtContent>
                               <w:p>
                                 <w:pPr>
-                                  <w:pStyle w:val="19"/>
+                                  <w:pStyle w:val="21"/>
                                   <w:jc w:val="right"/>
                                   <w:rPr>
                                     <w:color w:val="FFFFFF" w:themeColor="background1"/>
@@ -3721,7 +3721,7 @@
                             <w:txbxContent>
                               <w:p>
                                 <w:pPr>
-                                  <w:pStyle w:val="19"/>
+                                  <w:pStyle w:val="21"/>
                                   <w:rPr>
                                     <w:color w:val="4472C4" w:themeColor="accent1"/>
                                     <w:sz w:val="26"/>
@@ -3781,7 +3781,7 @@
                               </w:p>
                               <w:p>
                                 <w:pPr>
-                                  <w:pStyle w:val="19"/>
+                                  <w:pStyle w:val="21"/>
                                   <w:rPr>
                                     <w:color w:val="595959" w:themeColor="text1" w:themeTint="A6"/>
                                     <w:sz w:val="20"/>
@@ -3882,7 +3882,7 @@
                       <w:txbxContent>
                         <w:p>
                           <w:pPr>
-                            <w:pStyle w:val="19"/>
+                            <w:pStyle w:val="21"/>
                             <w:rPr>
                               <w:color w:val="4472C4" w:themeColor="accent1"/>
                               <w:sz w:val="26"/>
@@ -3942,7 +3942,7 @@
                         </w:p>
                         <w:p>
                           <w:pPr>
-                            <w:pStyle w:val="19"/>
+                            <w:pStyle w:val="21"/>
                             <w:rPr>
                               <w:color w:val="595959" w:themeColor="text1" w:themeTint="A6"/>
                               <w:sz w:val="20"/>
@@ -4095,7 +4095,7 @@
                             <w:txbxContent>
                               <w:p>
                                 <w:pPr>
-                                  <w:pStyle w:val="19"/>
+                                  <w:pStyle w:val="21"/>
                                   <w:rPr>
                                     <w:rFonts w:asciiTheme="majorHAnsi" w:hAnsiTheme="majorHAnsi" w:eastAsiaTheme="majorEastAsia" w:cstheme="majorBidi"/>
                                     <w:color w:val="0070C0"/>
@@ -4220,7 +4220,7 @@
                       <w:txbxContent>
                         <w:p>
                           <w:pPr>
-                            <w:pStyle w:val="19"/>
+                            <w:pStyle w:val="21"/>
                             <w:rPr>
                               <w:rFonts w:asciiTheme="majorHAnsi" w:hAnsiTheme="majorHAnsi" w:eastAsiaTheme="majorEastAsia" w:cstheme="majorBidi"/>
                               <w:color w:val="0070C0"/>
@@ -4464,6 +4464,170 @@
     <w:p>
       <w:pPr>
         <w:pStyle w:val="2"/>
+        <w:numPr>
+          <w:numId w:val="0"/>
+        </w:numPr>
+        <w:ind w:left="720" w:leftChars="0"/>
+        <w:rPr>
+          <w:rFonts w:hint="default"/>
+          <w:lang w:val="pt-BR"/>
+        </w:rPr>
+      </w:pPr>
+      <w:r>
+        <w:rPr>
+          <w:rFonts w:hint="default"/>
+          <w:lang w:val="pt-BR"/>
+        </w:rPr>
+        <w:t>Link GitHub</w:t>
+      </w:r>
+    </w:p>
+    <w:p>
+      <w:pPr>
+        <w:rPr>
+          <w:rFonts w:hint="default"/>
+        </w:rPr>
+      </w:pPr>
+      <w:r>
+        <w:rPr>
+          <w:rFonts w:hint="default"/>
+        </w:rPr>
+        <w:fldChar w:fldCharType="begin"/>
+      </w:r>
+      <w:r>
+        <w:rPr>
+          <w:rFonts w:hint="default"/>
+        </w:rPr>
+        <w:instrText xml:space="preserve"> HYPERLINK "https://github.com/faculdade-infnet/VI-1-velocidade-qualidade-com-algoritmos/tree/main/TP1" </w:instrText>
+      </w:r>
+      <w:r>
+        <w:rPr>
+          <w:rFonts w:hint="default"/>
+        </w:rPr>
+        <w:fldChar w:fldCharType="separate"/>
+      </w:r>
+      <w:r>
+        <w:rPr>
+          <w:rStyle w:val="11"/>
+          <w:rFonts w:hint="default"/>
+        </w:rPr>
+        <w:t>https://github.com/faculdade-infnet/VI-1-velocidade-qualidade-com-algoritmos/tree/main/TP1</w:t>
+      </w:r>
+      <w:r>
+        <w:rPr>
+          <w:rFonts w:hint="default"/>
+        </w:rPr>
+        <w:fldChar w:fldCharType="end"/>
+      </w:r>
+    </w:p>
+    <w:p>
+      <w:pPr>
+        <w:pStyle w:val="2"/>
+      </w:pPr>
+      <w:r>
+        <w:rPr>
+          <w:rFonts w:hint="default"/>
+          <w:lang w:val="pt-BR"/>
+        </w:rPr>
+        <w:t>Questão</w:t>
+      </w:r>
+    </w:p>
+    <w:p>
+      <w:pPr>
+        <w:rPr>
+          <w:rFonts w:hint="default"/>
+          <w:lang w:val="pt-BR"/>
+        </w:rPr>
+      </w:pPr>
+      <w:r>
+        <w:rPr>
+          <w:rFonts w:hint="default"/>
+          <w:lang w:val="pt-BR"/>
+        </w:rPr>
+        <w:t>Para r</w:t>
+      </w:r>
+      <w:r>
+        <w:rPr>
+          <w:rFonts w:hint="default"/>
+        </w:rPr>
+        <w:t>etorn</w:t>
+      </w:r>
+      <w:r>
+        <w:rPr>
+          <w:rFonts w:hint="default"/>
+          <w:lang w:val="pt-BR"/>
+        </w:rPr>
+        <w:t>ar</w:t>
+      </w:r>
+      <w:r>
+        <w:rPr>
+          <w:rFonts w:hint="default"/>
+        </w:rPr>
+        <w:t xml:space="preserve"> os caracteres individuais d</w:t>
+      </w:r>
+      <w:r>
+        <w:rPr>
+          <w:rFonts w:hint="default"/>
+          <w:lang w:val="pt-BR"/>
+        </w:rPr>
+        <w:t xml:space="preserve">a </w:t>
+      </w:r>
+      <w:r>
+        <w:rPr>
+          <w:rFonts w:hint="default"/>
+        </w:rPr>
+        <w:t>string que não são caracteres de espaço em branco</w:t>
+      </w:r>
+      <w:r>
+        <w:rPr>
+          <w:rFonts w:hint="default"/>
+          <w:lang w:val="pt-BR"/>
+        </w:rPr>
+        <w:t xml:space="preserve"> usando list comprehension, criei uma função e, nela, faço as seguintes verificações:</w:t>
+      </w:r>
+    </w:p>
+    <w:p>
+      <w:pPr>
+        <w:numPr>
+          <w:ilvl w:val="0"/>
+          <w:numId w:val="2"/>
+        </w:numPr>
+        <w:ind w:left="420" w:leftChars="0" w:hanging="420" w:firstLineChars="0"/>
+        <w:rPr>
+          <w:rFonts w:hint="default"/>
+          <w:lang w:val="pt-BR"/>
+        </w:rPr>
+      </w:pPr>
+      <w:r>
+        <w:rPr>
+          <w:rFonts w:hint="default"/>
+          <w:lang w:val="pt-BR"/>
+        </w:rPr>
+        <w:t>Percorro cada caractere do texto enviado e verifico se não é um caractere em branco;</w:t>
+      </w:r>
+    </w:p>
+    <w:p>
+      <w:pPr>
+        <w:numPr>
+          <w:ilvl w:val="0"/>
+          <w:numId w:val="2"/>
+        </w:numPr>
+        <w:ind w:left="420" w:leftChars="0" w:hanging="420" w:firstLineChars="0"/>
+        <w:rPr>
+          <w:rFonts w:hint="default"/>
+          <w:lang w:val="pt-BR"/>
+        </w:rPr>
+      </w:pPr>
+      <w:r>
+        <w:rPr>
+          <w:rFonts w:hint="default"/>
+          <w:lang w:val="pt-BR"/>
+        </w:rPr>
+        <w:t>No final da iteração completa do texto informado, são armazenados na variável caracteres apenas aqueles que correspondem à condição acima.</w:t>
+      </w:r>
+    </w:p>
+    <w:p>
+      <w:pPr>
+        <w:pStyle w:val="2"/>
       </w:pPr>
       <w:r>
         <w:rPr>
@@ -4486,115 +4650,1150 @@
         <w:t>Questão</w:t>
       </w:r>
     </w:p>
-    <w:p/>
     <w:p>
       <w:pPr>
-        <w:pStyle w:val="2"/>
-      </w:pPr>
-      <w:r>
-        <w:rPr>
-          <w:rFonts w:hint="default"/>
-          <w:lang w:val="pt-BR"/>
-        </w:rPr>
-        <w:t>Questão</w:t>
-      </w:r>
-    </w:p>
-    <w:p/>
-    <w:p>
-      <w:pPr>
-        <w:pStyle w:val="2"/>
-      </w:pPr>
-      <w:r>
-        <w:rPr>
-          <w:rFonts w:hint="default"/>
-          <w:lang w:val="pt-BR"/>
-        </w:rPr>
-        <w:t>Questão</w:t>
-      </w:r>
-    </w:p>
-    <w:p/>
-    <w:p>
-      <w:pPr>
-        <w:pStyle w:val="2"/>
-      </w:pPr>
-      <w:r>
-        <w:rPr>
-          <w:rFonts w:hint="default"/>
-          <w:lang w:val="pt-BR"/>
-        </w:rPr>
-        <w:t>Questão</w:t>
-      </w:r>
-    </w:p>
-    <w:p/>
-    <w:p>
-      <w:pPr>
-        <w:pStyle w:val="2"/>
-      </w:pPr>
-      <w:r>
-        <w:rPr>
-          <w:rFonts w:hint="default"/>
-          <w:lang w:val="pt-BR"/>
-        </w:rPr>
-        <w:t>Questão</w:t>
-      </w:r>
-    </w:p>
-    <w:p/>
-    <w:p>
-      <w:pPr>
-        <w:pStyle w:val="2"/>
-      </w:pPr>
-      <w:r>
-        <w:rPr>
-          <w:rFonts w:hint="default"/>
-          <w:lang w:val="pt-BR"/>
-        </w:rPr>
-        <w:t>Questão</w:t>
-      </w:r>
-    </w:p>
-    <w:p/>
-    <w:p>
-      <w:pPr>
-        <w:pStyle w:val="2"/>
-      </w:pPr>
-      <w:r>
-        <w:rPr>
-          <w:rFonts w:hint="default"/>
-          <w:lang w:val="pt-BR"/>
-        </w:rPr>
-        <w:t>Questão</w:t>
-      </w:r>
-    </w:p>
-    <w:p/>
-    <w:p>
-      <w:pPr>
-        <w:pStyle w:val="2"/>
-      </w:pPr>
-      <w:r>
-        <w:rPr>
-          <w:rFonts w:hint="default"/>
-          <w:lang w:val="pt-BR"/>
-        </w:rPr>
-        <w:t>Questão</w:t>
-      </w:r>
-    </w:p>
-    <w:p/>
-    <w:p>
-      <w:pPr>
-        <w:pStyle w:val="2"/>
-      </w:pPr>
-      <w:r>
-        <w:rPr>
-          <w:rFonts w:hint="default"/>
-          <w:lang w:val="pt-BR"/>
-        </w:rPr>
-        <w:t>Questão</w:t>
+        <w:rPr>
+          <w:rFonts w:hint="default"/>
+          <w:lang w:val="pt-BR"/>
+        </w:rPr>
+      </w:pPr>
+      <w:r>
+        <w:rPr>
+          <w:rFonts w:hint="default"/>
+          <w:lang w:val="pt-BR"/>
+        </w:rPr>
+        <w:t>Para encontrar o número 8 no array ordenado, [2, 4, 6, 8, 10, 12, 13] conforme solicitado na questão, são necessários 4 passos. Isso ocorre pois é uma busca linear simples e o array é percorrido sequencialmente elemento por elemento, até que o valor procurado seja encontrado. Como o número 8 procurado está na quarta posição, então são realizadas 4 comparações.</w:t>
       </w:r>
     </w:p>
     <w:p>
+      <w:pPr>
+        <w:pStyle w:val="2"/>
+      </w:pPr>
+      <w:r>
+        <w:rPr>
+          <w:rFonts w:hint="default"/>
+          <w:lang w:val="pt-BR"/>
+        </w:rPr>
+        <w:t>Questão</w:t>
+      </w:r>
+    </w:p>
+    <w:p>
+      <w:pPr>
+        <w:rPr>
+          <w:rFonts w:hint="default"/>
+          <w:lang w:val="pt-BR"/>
+        </w:rPr>
+      </w:pPr>
+      <w:r>
+        <w:rPr>
+          <w:rFonts w:hint="default"/>
+          <w:lang w:val="pt-BR"/>
+        </w:rPr>
+        <w:t>Para encontrar o número 8 no array ordenado, [2, 4, 6, 8, 10, 12, 13] conforme solicitado na questão anterior, é necessário 1 passo. Isso ocorre pois é uma busca binária, ou seja:</w:t>
+      </w:r>
+    </w:p>
+    <w:p>
+      <w:pPr>
+        <w:numPr>
+          <w:ilvl w:val="0"/>
+          <w:numId w:val="3"/>
+        </w:numPr>
+        <w:ind w:left="420" w:leftChars="0" w:hanging="420" w:firstLineChars="0"/>
+        <w:rPr>
+          <w:rFonts w:hint="default"/>
+          <w:lang w:val="pt-BR"/>
+        </w:rPr>
+      </w:pPr>
+      <w:r>
+        <w:rPr>
+          <w:rFonts w:hint="default"/>
+          <w:lang w:val="pt-BR"/>
+        </w:rPr>
+        <w:t>Obtém-se o total de elementos(7) - 1 = 6 pois a lista inicia a contagem em 0;</w:t>
+      </w:r>
+    </w:p>
+    <w:p>
+      <w:pPr>
+        <w:numPr>
+          <w:ilvl w:val="0"/>
+          <w:numId w:val="3"/>
+        </w:numPr>
+        <w:ind w:left="420" w:leftChars="0" w:hanging="420" w:firstLineChars="0"/>
+        <w:rPr>
+          <w:rFonts w:hint="default"/>
+          <w:lang w:val="pt-BR"/>
+        </w:rPr>
+      </w:pPr>
+      <w:r>
+        <w:rPr>
+          <w:rFonts w:hint="default"/>
+          <w:lang w:val="pt-BR"/>
+        </w:rPr>
+        <w:t>Encontramos o meio, (início + último elemento /2);</w:t>
+      </w:r>
+    </w:p>
+    <w:p>
+      <w:pPr>
+        <w:numPr>
+          <w:ilvl w:val="0"/>
+          <w:numId w:val="3"/>
+        </w:numPr>
+        <w:ind w:left="420" w:leftChars="0" w:hanging="420" w:firstLineChars="0"/>
+        <w:rPr>
+          <w:rFonts w:hint="default"/>
+          <w:lang w:val="pt-BR"/>
+        </w:rPr>
+      </w:pPr>
+      <w:r>
+        <w:rPr>
+          <w:rFonts w:hint="default"/>
+          <w:lang w:val="pt-BR"/>
+        </w:rPr>
+        <w:t>Substituindo (0 + 6)/2 = 3, este é o primeiro índice a ser verificado;</w:t>
+      </w:r>
+    </w:p>
+    <w:p>
+      <w:pPr>
+        <w:numPr>
+          <w:ilvl w:val="0"/>
+          <w:numId w:val="3"/>
+        </w:numPr>
+        <w:ind w:left="420" w:leftChars="0" w:hanging="420" w:firstLineChars="0"/>
+        <w:rPr>
+          <w:rFonts w:hint="default"/>
+          <w:lang w:val="pt-BR"/>
+        </w:rPr>
+      </w:pPr>
+      <w:r>
+        <w:rPr>
+          <w:rFonts w:hint="default"/>
+          <w:lang w:val="pt-BR"/>
+        </w:rPr>
+        <w:t>Observa-se que os índices e elementos são:</w:t>
+      </w:r>
+      <w:r>
+        <w:rPr>
+          <w:rFonts w:hint="default"/>
+          <w:lang w:val="pt-BR"/>
+        </w:rPr>
+        <w:br w:type="textWrapping"/>
+      </w:r>
+      <w:r>
+        <w:rPr>
+          <w:rFonts w:hint="default"/>
+          <w:lang w:val="pt-BR"/>
+        </w:rPr>
+        <w:t>[0]2, [1]4, [2]6, [3]8. Logo o índice 3 corresponde ao número procurado.</w:t>
+      </w:r>
+    </w:p>
+    <w:p>
+      <w:pPr>
+        <w:pStyle w:val="2"/>
+      </w:pPr>
+      <w:r>
+        <w:rPr>
+          <w:rFonts w:hint="default"/>
+          <w:lang w:val="pt-BR"/>
+        </w:rPr>
+        <w:t>Questão</w:t>
+      </w:r>
+    </w:p>
+    <w:p>
+      <w:pPr>
+        <w:rPr>
+          <w:rFonts w:hint="default"/>
+          <w:lang w:val="pt-BR"/>
+        </w:rPr>
+      </w:pPr>
+      <w:r>
+        <w:rPr>
+          <w:rFonts w:hint="default"/>
+          <w:color w:val="C00000"/>
+          <w:lang w:val="pt-BR"/>
+        </w:rPr>
+        <w:t xml:space="preserve">Obs. Segundo enunciado a função encontra o maior número </w:t>
+      </w:r>
+      <w:r>
+        <w:rPr>
+          <w:rFonts w:hint="default"/>
+          <w:b/>
+          <w:bCs/>
+          <w:color w:val="C00000"/>
+          <w:lang w:val="pt-BR"/>
+        </w:rPr>
+        <w:t xml:space="preserve">único </w:t>
+      </w:r>
+      <w:r>
+        <w:rPr>
+          <w:rFonts w:hint="default"/>
+          <w:color w:val="C00000"/>
+          <w:lang w:val="pt-BR"/>
+        </w:rPr>
+        <w:t>dentro de um array, mas tem uma eficiência de O(n²), entretanto a função não faz realmente isso, ela encontra somente o maior número, não distingue se esse número é duplicado. Como pede no enunciado para modificar para O(n), foi isso que fiz.</w:t>
+      </w:r>
+    </w:p>
+    <w:p>
+      <w:pPr>
+        <w:rPr>
+          <w:rFonts w:hint="default"/>
+          <w:lang w:val="pt-BR"/>
+        </w:rPr>
+      </w:pPr>
+      <w:r>
+        <w:rPr>
+          <w:rFonts w:hint="default"/>
+          <w:lang w:val="pt-BR"/>
+        </w:rPr>
+        <w:t>No arquivo Python consta os dois códigos O(n²) e O(n).</w:t>
+      </w:r>
+    </w:p>
+    <w:p>
+      <w:pPr>
+        <w:rPr>
+          <w:rFonts w:hint="default"/>
+          <w:lang w:val="pt-BR"/>
+        </w:rPr>
+      </w:pPr>
+      <w:r>
+        <w:rPr>
+          <w:rFonts w:hint="default"/>
+          <w:lang w:val="pt-BR"/>
+        </w:rPr>
+        <w:t>Explicação passo a passo:</w:t>
+      </w:r>
+    </w:p>
+    <w:p>
+      <w:pPr>
+        <w:numPr>
+          <w:ilvl w:val="0"/>
+          <w:numId w:val="4"/>
+        </w:numPr>
+        <w:ind w:left="420" w:leftChars="0" w:hanging="420" w:firstLineChars="0"/>
+        <w:rPr>
+          <w:rFonts w:hint="default"/>
+          <w:lang w:val="pt-BR"/>
+        </w:rPr>
+      </w:pPr>
+      <w:r>
+        <w:rPr>
+          <w:rFonts w:hint="default"/>
+          <w:lang w:val="pt-BR"/>
+        </w:rPr>
+        <w:t>Iniciei armazenando o primeiro valor da lista para ter com o que comparar</w:t>
+      </w:r>
+    </w:p>
+    <w:p>
+      <w:pPr>
+        <w:numPr>
+          <w:ilvl w:val="0"/>
+          <w:numId w:val="4"/>
+        </w:numPr>
+        <w:ind w:left="420" w:leftChars="0" w:hanging="420" w:firstLineChars="0"/>
+        <w:rPr>
+          <w:rFonts w:hint="default"/>
+          <w:lang w:val="pt-BR"/>
+        </w:rPr>
+      </w:pPr>
+      <w:r>
+        <w:rPr>
+          <w:rFonts w:hint="default"/>
+          <w:lang w:val="pt-BR"/>
+        </w:rPr>
+        <w:t xml:space="preserve">No </w:t>
+      </w:r>
+      <w:r>
+        <w:rPr>
+          <w:rFonts w:hint="default"/>
+          <w:b/>
+          <w:bCs/>
+          <w:lang w:val="pt-BR"/>
+        </w:rPr>
+        <w:t>loop fo</w:t>
+      </w:r>
+      <w:r>
+        <w:rPr>
+          <w:rFonts w:hint="default"/>
+          <w:lang w:val="pt-BR"/>
+        </w:rPr>
+        <w:t>r eu percorro a quantidade de elementos da lista -1 pois inicio a comparação do próximo elemento que está sendo lido com o maiorValor armazenado.</w:t>
+      </w:r>
+    </w:p>
+    <w:p>
+      <w:pPr>
+        <w:numPr>
+          <w:ilvl w:val="0"/>
+          <w:numId w:val="4"/>
+        </w:numPr>
+        <w:ind w:left="420" w:leftChars="0" w:hanging="420" w:firstLineChars="0"/>
+        <w:rPr>
+          <w:rFonts w:hint="default"/>
+          <w:lang w:val="pt-BR"/>
+        </w:rPr>
+      </w:pPr>
+      <w:r>
+        <w:rPr>
+          <w:rFonts w:hint="default"/>
+          <w:lang w:val="pt-BR"/>
+        </w:rPr>
+        <w:t>Se o próximo valor do loop for maior que o valor armazenado na variável maiorValor, então atualiza ela para o valor de comparação.</w:t>
+      </w:r>
+    </w:p>
+    <w:p>
+      <w:pPr>
+        <w:numPr>
+          <w:ilvl w:val="0"/>
+          <w:numId w:val="4"/>
+        </w:numPr>
+        <w:ind w:left="420" w:leftChars="0" w:hanging="420" w:firstLineChars="0"/>
+        <w:rPr>
+          <w:rFonts w:hint="default"/>
+          <w:lang w:val="pt-BR"/>
+        </w:rPr>
+      </w:pPr>
+      <w:r>
+        <w:rPr>
+          <w:rFonts w:hint="default"/>
+          <w:lang w:val="pt-BR"/>
+        </w:rPr>
+        <w:t xml:space="preserve">Esse processo de comparação ocorre para cada elemento do for uma vez apenas </w:t>
+      </w:r>
+      <w:r>
+        <w:rPr>
+          <w:rFonts w:hint="default"/>
+          <w:b/>
+          <w:bCs/>
+          <w:lang w:val="pt-BR"/>
+        </w:rPr>
+        <w:t>O(n)</w:t>
+      </w:r>
+      <w:r>
+        <w:rPr>
+          <w:rFonts w:hint="default"/>
+          <w:lang w:val="pt-BR"/>
+        </w:rPr>
+        <w:t>.</w:t>
+      </w:r>
+    </w:p>
+    <w:p>
+      <w:pPr>
+        <w:numPr>
+          <w:ilvl w:val="0"/>
+          <w:numId w:val="4"/>
+        </w:numPr>
+        <w:ind w:left="420" w:leftChars="0" w:hanging="420" w:firstLineChars="0"/>
+        <w:rPr>
+          <w:rFonts w:hint="default"/>
+          <w:lang w:val="pt-BR"/>
+        </w:rPr>
+      </w:pPr>
+      <w:r>
+        <w:rPr>
+          <w:rFonts w:hint="default"/>
+          <w:lang w:val="pt-BR"/>
+        </w:rPr>
+        <w:t>Após o fim do loop é retornado na função a variável maiorValor que contém o maior valor encontrado dentro do array</w:t>
+      </w:r>
+    </w:p>
+    <w:p>
+      <w:pPr>
+        <w:numPr>
+          <w:ilvl w:val="0"/>
+          <w:numId w:val="4"/>
+        </w:numPr>
+        <w:ind w:left="420" w:leftChars="0" w:hanging="420" w:firstLineChars="0"/>
+        <w:rPr>
+          <w:rFonts w:hint="default"/>
+          <w:lang w:val="pt-BR"/>
+        </w:rPr>
+      </w:pPr>
+      <w:r>
+        <w:rPr>
+          <w:rFonts w:hint="default"/>
+          <w:lang w:val="pt-BR"/>
+        </w:rPr>
+        <w:t>Após isso o valor é exibido em tela.</w:t>
+      </w:r>
+    </w:p>
+    <w:p>
+      <w:pPr>
+        <w:pStyle w:val="2"/>
+      </w:pPr>
+      <w:r>
+        <w:rPr>
+          <w:rFonts w:hint="default"/>
+          <w:lang w:val="pt-BR"/>
+        </w:rPr>
+        <w:t>Questão</w:t>
+      </w:r>
+    </w:p>
+    <w:p>
+      <w:pPr>
+        <w:pStyle w:val="3"/>
+        <w:bidi w:val="0"/>
+        <w:rPr>
+          <w:rFonts w:hint="default"/>
+          <w:lang w:val="pt-BR"/>
+        </w:rPr>
+      </w:pPr>
+      <w:r>
+        <w:rPr>
+          <w:rFonts w:hint="default"/>
+          <w:lang w:val="pt-BR"/>
+        </w:rPr>
+        <w:t>A)</w:t>
+      </w:r>
+    </w:p>
+    <w:p>
+      <w:pPr>
+        <w:rPr>
+          <w:rFonts w:hint="default"/>
+          <w:lang w:val="pt-BR"/>
+        </w:rPr>
+      </w:pPr>
+      <w:r>
+        <w:rPr>
+          <w:rFonts w:hint="default"/>
+          <w:lang w:val="pt-BR"/>
+        </w:rPr>
+        <w:t>No meu entendimento, conclui que o número de grãos devia ser dividido até chegar ao mínimo que é 1. Explicação passo a passo:</w:t>
+      </w:r>
+    </w:p>
+    <w:p>
+      <w:pPr>
+        <w:numPr>
+          <w:ilvl w:val="0"/>
+          <w:numId w:val="5"/>
+        </w:numPr>
+        <w:ind w:left="420" w:leftChars="0" w:hanging="420" w:firstLineChars="0"/>
+        <w:rPr>
+          <w:rFonts w:hint="default"/>
+          <w:lang w:val="pt-BR"/>
+        </w:rPr>
+      </w:pPr>
+      <w:r>
+        <w:rPr>
+          <w:rFonts w:hint="default"/>
+          <w:lang w:val="pt-BR"/>
+        </w:rPr>
+        <w:t>Dentro da função no início declaro a variável quadrados com valor 1, pois o mínimo de quadrados que podem existir é 1;</w:t>
+      </w:r>
+    </w:p>
+    <w:p>
+      <w:pPr>
+        <w:numPr>
+          <w:ilvl w:val="0"/>
+          <w:numId w:val="5"/>
+        </w:numPr>
+        <w:ind w:left="420" w:leftChars="0" w:hanging="420" w:firstLineChars="0"/>
+        <w:rPr>
+          <w:rFonts w:hint="default"/>
+          <w:lang w:val="pt-BR"/>
+        </w:rPr>
+      </w:pPr>
+      <w:r>
+        <w:rPr>
+          <w:rFonts w:hint="default"/>
+          <w:lang w:val="pt-BR"/>
+        </w:rPr>
+        <w:t>Em sequência tenho o loop while onde verifico se o número de grãos informado é maior que 1, pois enquanto a condição for atendida continuará fazendo a divisão por 2 dentro do loop;</w:t>
+      </w:r>
+    </w:p>
+    <w:p>
+      <w:pPr>
+        <w:numPr>
+          <w:ilvl w:val="0"/>
+          <w:numId w:val="5"/>
+        </w:numPr>
+        <w:ind w:left="420" w:leftChars="0" w:hanging="420" w:firstLineChars="0"/>
+        <w:rPr>
+          <w:rFonts w:hint="default"/>
+          <w:lang w:val="pt-BR"/>
+        </w:rPr>
+      </w:pPr>
+      <w:r>
+        <w:rPr>
+          <w:rFonts w:hint="default"/>
+          <w:lang w:val="pt-BR"/>
+        </w:rPr>
+        <w:t>Divido o numeroGraos atual por 2 e armazeno na própria variável;</w:t>
+      </w:r>
+    </w:p>
+    <w:p>
+      <w:pPr>
+        <w:numPr>
+          <w:ilvl w:val="0"/>
+          <w:numId w:val="5"/>
+        </w:numPr>
+        <w:ind w:left="420" w:leftChars="0" w:hanging="420" w:firstLineChars="0"/>
+        <w:rPr>
+          <w:rFonts w:hint="default"/>
+          <w:lang w:val="pt-BR"/>
+        </w:rPr>
+      </w:pPr>
+      <w:r>
+        <w:rPr>
+          <w:rFonts w:hint="default"/>
+          <w:lang w:val="pt-BR"/>
+        </w:rPr>
+        <w:t>Adiciono + 1 a variável que faz a contagem dos quadrados;</w:t>
+      </w:r>
+    </w:p>
+    <w:p>
+      <w:pPr>
+        <w:numPr>
+          <w:ilvl w:val="0"/>
+          <w:numId w:val="5"/>
+        </w:numPr>
+        <w:ind w:left="420" w:leftChars="0" w:hanging="420" w:firstLineChars="0"/>
+        <w:rPr>
+          <w:rFonts w:hint="default"/>
+          <w:lang w:val="pt-BR"/>
+        </w:rPr>
+      </w:pPr>
+      <w:r>
+        <w:rPr>
+          <w:rFonts w:hint="default"/>
+          <w:lang w:val="pt-BR"/>
+        </w:rPr>
+        <w:t>Assim ao final do loop tenho o número para saber em qual quadrado serão colocados a quantidade de grãos informados.</w:t>
+      </w:r>
+    </w:p>
+    <w:p>
+      <w:pPr>
+        <w:pStyle w:val="3"/>
+        <w:bidi w:val="0"/>
+        <w:rPr>
+          <w:rFonts w:hint="default"/>
+          <w:lang w:val="pt-BR"/>
+        </w:rPr>
+      </w:pPr>
+      <w:r>
+        <w:rPr>
+          <w:rFonts w:hint="default"/>
+          <w:lang w:val="pt-BR"/>
+        </w:rPr>
+        <w:t>B)</w:t>
+      </w:r>
+      <w:r>
+        <w:rPr>
+          <w:rFonts w:hint="default"/>
+          <w:b/>
+          <w:bCs/>
+          <w:color w:val="C00000"/>
+          <w:lang w:val="pt-BR"/>
+        </w:rPr>
+        <w:t>TODAS AS IMAGENS ABAIXO SÃO ORIUNDAS DO DOCUMENTO QUE FIZ NO NOTION.SO.</w:t>
+      </w:r>
+    </w:p>
+    <w:p>
+      <w:pPr>
+        <w:rPr>
+          <w:rFonts w:hint="default"/>
+          <w:lang w:val="pt-BR"/>
+        </w:rPr>
+      </w:pPr>
+      <w:r>
+        <w:rPr>
+          <w:rFonts w:hint="default"/>
+          <w:lang w:val="pt-BR"/>
+        </w:rPr>
+        <w:t xml:space="preserve">Link: </w:t>
+      </w:r>
+      <w:r>
+        <w:rPr>
+          <w:rFonts w:hint="default"/>
+          <w:lang w:val="pt-BR"/>
+        </w:rPr>
+        <w:fldChar w:fldCharType="begin"/>
+      </w:r>
+      <w:r>
+        <w:rPr>
+          <w:rFonts w:hint="default"/>
+          <w:lang w:val="pt-BR"/>
+        </w:rPr>
+        <w:instrText xml:space="preserve"> HYPERLINK "https://www.notion.so/TP1-Quest-es-com-C-culo-de-complexidade-2f6ab4aadb258115a462f8ff9f865847?source=copy_link" </w:instrText>
+      </w:r>
+      <w:r>
+        <w:rPr>
+          <w:rFonts w:hint="default"/>
+          <w:lang w:val="pt-BR"/>
+        </w:rPr>
+        <w:fldChar w:fldCharType="separate"/>
+      </w:r>
+      <w:r>
+        <w:rPr>
+          <w:rStyle w:val="11"/>
+          <w:rFonts w:hint="default"/>
+          <w:lang w:val="pt-BR"/>
+        </w:rPr>
+        <w:t>https://www.notion.so/TP1-Quest-es-com-C-culo-de-complexidade-2f6ab4aadb258115a462f8ff9f865847?source=copy_link</w:t>
+      </w:r>
+      <w:r>
+        <w:rPr>
+          <w:rFonts w:hint="default"/>
+          <w:lang w:val="pt-BR"/>
+        </w:rPr>
+        <w:fldChar w:fldCharType="end"/>
+      </w:r>
+    </w:p>
+    <w:p>
+      <w:pPr>
+        <w:rPr>
+          <w:rFonts w:hint="default"/>
+          <w:lang w:val="pt-BR"/>
+        </w:rPr>
+      </w:pPr>
+    </w:p>
+    <w:p>
+      <w:pPr>
+        <w:jc w:val="center"/>
+        <w:rPr>
+          <w:rFonts w:hint="default"/>
+          <w:lang w:val="pt-BR"/>
+        </w:rPr>
+      </w:pPr>
+      <w:r>
+        <w:rPr>
+          <w:rFonts w:hint="default"/>
+          <w:lang w:val="pt-BR"/>
+        </w:rPr>
+        <w:drawing>
+          <wp:inline distT="0" distB="0" distL="114300" distR="114300">
+            <wp:extent cx="6318885" cy="3565525"/>
+            <wp:effectExtent l="0" t="0" r="5715" b="15875"/>
+            <wp:docPr id="36" name="Picture 36" descr="Screenshot 2026-02-18 021720"/>
+            <wp:cNvGraphicFramePr>
+              <a:graphicFrameLocks xmlns:a="http://schemas.openxmlformats.org/drawingml/2006/main" noChangeAspect="1"/>
+            </wp:cNvGraphicFramePr>
+            <a:graphic xmlns:a="http://schemas.openxmlformats.org/drawingml/2006/main">
+              <a:graphicData uri="http://schemas.openxmlformats.org/drawingml/2006/picture">
+                <pic:pic xmlns:pic="http://schemas.openxmlformats.org/drawingml/2006/picture">
+                  <pic:nvPicPr>
+                    <pic:cNvPr id="36" name="Picture 36" descr="Screenshot 2026-02-18 021720"/>
+                    <pic:cNvPicPr>
+                      <a:picLocks noChangeAspect="1"/>
+                    </pic:cNvPicPr>
+                  </pic:nvPicPr>
+                  <pic:blipFill>
+                    <a:blip r:embed="rId6"/>
+                    <a:srcRect t="3024" b="53188"/>
+                    <a:stretch>
+                      <a:fillRect/>
+                    </a:stretch>
+                  </pic:blipFill>
+                  <pic:spPr>
+                    <a:xfrm>
+                      <a:off x="0" y="0"/>
+                      <a:ext cx="6318885" cy="3565525"/>
+                    </a:xfrm>
+                    <a:prstGeom prst="rect">
+                      <a:avLst/>
+                    </a:prstGeom>
+                  </pic:spPr>
+                </pic:pic>
+              </a:graphicData>
+            </a:graphic>
+          </wp:inline>
+        </w:drawing>
+      </w:r>
+    </w:p>
+    <w:p>
+      <w:pPr>
+        <w:jc w:val="center"/>
+        <w:rPr>
+          <w:rFonts w:hint="default"/>
+          <w:lang w:val="pt-BR"/>
+        </w:rPr>
+      </w:pPr>
+      <w:r>
+        <w:rPr>
+          <w:rFonts w:hint="default"/>
+          <w:lang w:val="pt-BR"/>
+        </w:rPr>
+        <w:drawing>
+          <wp:inline distT="0" distB="0" distL="114300" distR="114300">
+            <wp:extent cx="5810250" cy="9096375"/>
+            <wp:effectExtent l="0" t="0" r="0" b="9525"/>
+            <wp:docPr id="42" name="Picture 42" descr="Screenshot 2026-02-18 032502"/>
+            <wp:cNvGraphicFramePr>
+              <a:graphicFrameLocks xmlns:a="http://schemas.openxmlformats.org/drawingml/2006/main" noChangeAspect="1"/>
+            </wp:cNvGraphicFramePr>
+            <a:graphic xmlns:a="http://schemas.openxmlformats.org/drawingml/2006/main">
+              <a:graphicData uri="http://schemas.openxmlformats.org/drawingml/2006/picture">
+                <pic:pic xmlns:pic="http://schemas.openxmlformats.org/drawingml/2006/picture">
+                  <pic:nvPicPr>
+                    <pic:cNvPr id="42" name="Picture 42" descr="Screenshot 2026-02-18 032502"/>
+                    <pic:cNvPicPr>
+                      <a:picLocks noChangeAspect="1"/>
+                    </pic:cNvPicPr>
+                  </pic:nvPicPr>
+                  <pic:blipFill>
+                    <a:blip r:embed="rId7"/>
+                    <a:stretch>
+                      <a:fillRect/>
+                    </a:stretch>
+                  </pic:blipFill>
+                  <pic:spPr>
+                    <a:xfrm>
+                      <a:off x="0" y="0"/>
+                      <a:ext cx="5810250" cy="9096375"/>
+                    </a:xfrm>
+                    <a:prstGeom prst="rect">
+                      <a:avLst/>
+                    </a:prstGeom>
+                  </pic:spPr>
+                </pic:pic>
+              </a:graphicData>
+            </a:graphic>
+          </wp:inline>
+        </w:drawing>
+      </w:r>
+    </w:p>
+    <w:p>
+      <w:pPr>
+        <w:rPr>
+          <w:rFonts w:hint="default"/>
+          <w:lang w:val="pt-BR"/>
+        </w:rPr>
+      </w:pPr>
       <w:bookmarkStart w:id="0" w:name="_GoBack"/>
       <w:bookmarkEnd w:id="0"/>
     </w:p>
-    <w:p/>
+    <w:p>
+      <w:pPr>
+        <w:pStyle w:val="2"/>
+      </w:pPr>
+      <w:r>
+        <w:rPr>
+          <w:rFonts w:hint="default"/>
+          <w:lang w:val="pt-BR"/>
+        </w:rPr>
+        <w:t>Questão</w:t>
+      </w:r>
+    </w:p>
+    <w:p>
+      <w:r>
+        <w:t>A seguinte função aceita um array de strings e retorna um novo array que contém apenas as strings que começam com o caractere "a". Use a Notação Big O para descrever a complexidade de tempo da função:</w:t>
+      </w:r>
+    </w:p>
+    <w:p>
+      <w:pPr>
+        <w:rPr>
+          <w:rFonts w:hint="default"/>
+          <w:lang w:val="pt-BR"/>
+        </w:rPr>
+      </w:pPr>
+      <w:r>
+        <w:rPr>
+          <w:rFonts w:hint="default"/>
+          <w:b/>
+          <w:bCs/>
+          <w:color w:val="C00000"/>
+          <w:lang w:val="pt-BR"/>
+        </w:rPr>
+        <w:t>TODAS AS IMAGENS ABAIXO SÃO ORIUNDAS DO DOCUMENTO QUE FIZ NO NOTION.SO.</w:t>
+      </w:r>
+    </w:p>
+    <w:p>
+      <w:pPr>
+        <w:rPr>
+          <w:rFonts w:hint="default"/>
+          <w:lang w:val="pt-BR"/>
+        </w:rPr>
+      </w:pPr>
+      <w:r>
+        <w:rPr>
+          <w:rFonts w:hint="default"/>
+          <w:lang w:val="pt-BR"/>
+        </w:rPr>
+        <w:t xml:space="preserve">Link: </w:t>
+      </w:r>
+      <w:r>
+        <w:rPr>
+          <w:rFonts w:hint="default"/>
+          <w:lang w:val="pt-BR"/>
+        </w:rPr>
+        <w:fldChar w:fldCharType="begin"/>
+      </w:r>
+      <w:r>
+        <w:rPr>
+          <w:rFonts w:hint="default"/>
+          <w:lang w:val="pt-BR"/>
+        </w:rPr>
+        <w:instrText xml:space="preserve"> HYPERLINK "https://www.notion.so/TP1-Quest-es-com-C-culo-de-complexidade-2f6ab4aadb258115a462f8ff9f865847?source=copy_link" </w:instrText>
+      </w:r>
+      <w:r>
+        <w:rPr>
+          <w:rFonts w:hint="default"/>
+          <w:lang w:val="pt-BR"/>
+        </w:rPr>
+        <w:fldChar w:fldCharType="separate"/>
+      </w:r>
+      <w:r>
+        <w:rPr>
+          <w:rStyle w:val="11"/>
+          <w:rFonts w:hint="default"/>
+          <w:lang w:val="pt-BR"/>
+        </w:rPr>
+        <w:t>https://www.notion.so/TP1-Quest-es-com-C-culo-de-complexidade-2f6ab4aadb258115a462f8ff9f865847?source=copy_link</w:t>
+      </w:r>
+      <w:r>
+        <w:rPr>
+          <w:rFonts w:hint="default"/>
+          <w:lang w:val="pt-BR"/>
+        </w:rPr>
+        <w:fldChar w:fldCharType="end"/>
+      </w:r>
+    </w:p>
+    <w:p>
+      <w:pPr>
+        <w:jc w:val="center"/>
+        <w:rPr>
+          <w:rFonts w:hint="default"/>
+          <w:lang w:val="pt-BR"/>
+        </w:rPr>
+      </w:pPr>
+      <w:r>
+        <w:rPr>
+          <w:rFonts w:hint="default"/>
+          <w:lang w:val="pt-BR"/>
+        </w:rPr>
+        <w:drawing>
+          <wp:inline distT="0" distB="0" distL="114300" distR="114300">
+            <wp:extent cx="6475730" cy="7530465"/>
+            <wp:effectExtent l="0" t="0" r="1270" b="13335"/>
+            <wp:docPr id="40" name="Picture 40" descr="Screenshot 2026-02-18 031904"/>
+            <wp:cNvGraphicFramePr>
+              <a:graphicFrameLocks xmlns:a="http://schemas.openxmlformats.org/drawingml/2006/main" noChangeAspect="1"/>
+            </wp:cNvGraphicFramePr>
+            <a:graphic xmlns:a="http://schemas.openxmlformats.org/drawingml/2006/main">
+              <a:graphicData uri="http://schemas.openxmlformats.org/drawingml/2006/picture">
+                <pic:pic xmlns:pic="http://schemas.openxmlformats.org/drawingml/2006/picture">
+                  <pic:nvPicPr>
+                    <pic:cNvPr id="40" name="Picture 40" descr="Screenshot 2026-02-18 031904"/>
+                    <pic:cNvPicPr>
+                      <a:picLocks noChangeAspect="1"/>
+                    </pic:cNvPicPr>
+                  </pic:nvPicPr>
+                  <pic:blipFill>
+                    <a:blip r:embed="rId8"/>
+                    <a:stretch>
+                      <a:fillRect/>
+                    </a:stretch>
+                  </pic:blipFill>
+                  <pic:spPr>
+                    <a:xfrm>
+                      <a:off x="0" y="0"/>
+                      <a:ext cx="6475730" cy="7530465"/>
+                    </a:xfrm>
+                    <a:prstGeom prst="rect">
+                      <a:avLst/>
+                    </a:prstGeom>
+                  </pic:spPr>
+                </pic:pic>
+              </a:graphicData>
+            </a:graphic>
+          </wp:inline>
+        </w:drawing>
+      </w:r>
+    </w:p>
+    <w:p>
+      <w:pPr>
+        <w:jc w:val="center"/>
+        <w:rPr>
+          <w:rFonts w:hint="default"/>
+          <w:lang w:val="pt-BR"/>
+        </w:rPr>
+      </w:pPr>
+      <w:r>
+        <w:rPr>
+          <w:rFonts w:hint="default"/>
+          <w:lang w:val="pt-BR"/>
+        </w:rPr>
+        <w:drawing>
+          <wp:inline distT="0" distB="0" distL="114300" distR="114300">
+            <wp:extent cx="6115050" cy="5962650"/>
+            <wp:effectExtent l="0" t="0" r="0" b="0"/>
+            <wp:docPr id="41" name="Picture 41" descr="Screenshot 2026-02-18 031945"/>
+            <wp:cNvGraphicFramePr>
+              <a:graphicFrameLocks xmlns:a="http://schemas.openxmlformats.org/drawingml/2006/main" noChangeAspect="1"/>
+            </wp:cNvGraphicFramePr>
+            <a:graphic xmlns:a="http://schemas.openxmlformats.org/drawingml/2006/main">
+              <a:graphicData uri="http://schemas.openxmlformats.org/drawingml/2006/picture">
+                <pic:pic xmlns:pic="http://schemas.openxmlformats.org/drawingml/2006/picture">
+                  <pic:nvPicPr>
+                    <pic:cNvPr id="41" name="Picture 41" descr="Screenshot 2026-02-18 031945"/>
+                    <pic:cNvPicPr>
+                      <a:picLocks noChangeAspect="1"/>
+                    </pic:cNvPicPr>
+                  </pic:nvPicPr>
+                  <pic:blipFill>
+                    <a:blip r:embed="rId9"/>
+                    <a:stretch>
+                      <a:fillRect/>
+                    </a:stretch>
+                  </pic:blipFill>
+                  <pic:spPr>
+                    <a:xfrm>
+                      <a:off x="0" y="0"/>
+                      <a:ext cx="6115050" cy="5962650"/>
+                    </a:xfrm>
+                    <a:prstGeom prst="rect">
+                      <a:avLst/>
+                    </a:prstGeom>
+                  </pic:spPr>
+                </pic:pic>
+              </a:graphicData>
+            </a:graphic>
+          </wp:inline>
+        </w:drawing>
+      </w:r>
+    </w:p>
+    <w:p>
+      <w:pPr>
+        <w:pStyle w:val="2"/>
+      </w:pPr>
+      <w:r>
+        <w:rPr>
+          <w:rFonts w:hint="default"/>
+          <w:lang w:val="pt-BR"/>
+        </w:rPr>
+        <w:t>Questão</w:t>
+      </w:r>
+    </w:p>
+    <w:p>
+      <w:pPr>
+        <w:rPr>
+          <w:rFonts w:hint="default"/>
+          <w:lang w:val="pt-BR"/>
+        </w:rPr>
+      </w:pPr>
+      <w:r>
+        <w:rPr>
+          <w:rFonts w:hint="default"/>
+          <w:lang w:val="pt-BR"/>
+        </w:rPr>
+        <w:t>Aqui utilizei duas formas de ordenação simultâneas a cada iteração do loop while é realizado duas varreduras, uma à esquerda para a direita e outra da direita para a esquerda.</w:t>
+      </w:r>
+    </w:p>
+    <w:p>
+      <w:pPr>
+        <w:rPr>
+          <w:rFonts w:hint="default"/>
+          <w:lang w:val="pt-BR"/>
+        </w:rPr>
+      </w:pPr>
+      <w:r>
+        <w:rPr>
+          <w:rFonts w:hint="default"/>
+          <w:lang w:val="pt-BR"/>
+        </w:rPr>
+        <w:t>Com isso o número de passadas pela função tende a diminuir (pela metade aproximadamente), pois a cada passada a aplicação efetua a ordenação de 2 elementos, um mais à esquerda(início) e outra mais à direita(fim).</w:t>
+      </w:r>
+    </w:p>
+    <w:p>
+      <w:pPr>
+        <w:rPr>
+          <w:rFonts w:hint="default"/>
+          <w:lang w:val="pt-BR"/>
+        </w:rPr>
+      </w:pPr>
+      <w:r>
+        <w:rPr>
+          <w:rFonts w:hint="default"/>
+          <w:lang w:val="pt-BR"/>
+        </w:rPr>
+        <w:t>Entretanto é somente isso que muda, pois a complexidade continua a mesma, pois a cada passada ainda é necessário fazer duas comparações.</w:t>
+      </w:r>
+    </w:p>
+    <w:p>
+      <w:pPr>
+        <w:rPr>
+          <w:rFonts w:hint="default"/>
+          <w:lang w:val="pt-BR"/>
+        </w:rPr>
+      </w:pPr>
+      <w:r>
+        <w:rPr>
+          <w:rFonts w:hint="default"/>
+          <w:lang w:val="pt-BR"/>
+        </w:rPr>
+        <w:t>Entre os quatro tipos de lista que testei e pesquise, a diferença é perceptível onde os valores extremos estão fora do lugar, devido a quantidade de trocas ser menor.</w:t>
+      </w:r>
+    </w:p>
+    <w:p>
+      <w:pPr>
+        <w:pStyle w:val="2"/>
+        <w:sectPr>
+          <w:pgSz w:w="11906" w:h="16838"/>
+          <w:pgMar w:top="851" w:right="851" w:bottom="851" w:left="851" w:header="709" w:footer="709" w:gutter="0"/>
+          <w:pgNumType w:start="0"/>
+          <w:cols w:space="708" w:num="1"/>
+          <w:titlePg/>
+          <w:docGrid w:linePitch="360" w:charSpace="0"/>
+        </w:sectPr>
+      </w:pPr>
+    </w:p>
+    <w:p>
+      <w:pPr>
+        <w:pStyle w:val="2"/>
+      </w:pPr>
+      <w:r>
+        <w:rPr>
+          <w:rFonts w:hint="default"/>
+          <w:lang w:val="pt-BR"/>
+        </w:rPr>
+        <w:t>Questão</w:t>
+      </w:r>
+    </w:p>
+    <w:p>
+      <w:pPr>
+        <w:rPr>
+          <w:rFonts w:hint="default"/>
+          <w:lang w:val="pt-BR"/>
+        </w:rPr>
+      </w:pPr>
+      <w:r>
+        <w:rPr>
+          <w:rFonts w:hint="default"/>
+          <w:lang w:val="pt-BR"/>
+        </w:rPr>
+        <w:t>Aqui a lista é composta por valores numéricos e é ordenada em ordem crescente.</w:t>
+      </w:r>
+    </w:p>
+    <w:p>
+      <w:pPr>
+        <w:rPr>
+          <w:rFonts w:hint="default"/>
+          <w:lang w:val="pt-BR"/>
+        </w:rPr>
+      </w:pPr>
+      <w:r>
+        <w:rPr>
+          <w:rFonts w:hint="default"/>
+          <w:lang w:val="pt-BR"/>
+        </w:rPr>
+        <w:t>O loop for externo percorre todos os itens da lista, já o loop for interno faz comparações entre elementos vizinhos. O if seguinte compara o valor atual com o próximo, se o elemento da posição atual for maior que o seguinte, ocorre a troca de posições.</w:t>
+      </w:r>
+    </w:p>
+    <w:p>
+      <w:pPr>
+        <w:rPr>
+          <w:rFonts w:hint="default"/>
+          <w:lang w:val="pt-BR"/>
+        </w:rPr>
+      </w:pPr>
+      <w:r>
+        <w:rPr>
+          <w:rFonts w:hint="default"/>
+          <w:lang w:val="pt-BR"/>
+        </w:rPr>
+        <w:t>Dentro do if, fazemos as trocas de posições e informamos em sequência que foi trocado pelo menos uma vez nessa passada.</w:t>
+      </w:r>
+    </w:p>
+    <w:p>
+      <w:pPr>
+        <w:rPr>
+          <w:rFonts w:hint="default"/>
+          <w:lang w:val="pt-BR"/>
+        </w:rPr>
+      </w:pPr>
+      <w:r>
+        <w:rPr>
+          <w:rFonts w:hint="default"/>
+          <w:lang w:val="pt-BR"/>
+        </w:rPr>
+        <w:t>O último if verifica se nenhuma troca foi realizada, caso isso ocorra, a lista já está ordenada e pode-se encerrar a aplicação antecipadamente.</w:t>
+      </w:r>
+    </w:p>
+    <w:p>
+      <w:pPr>
+        <w:pStyle w:val="2"/>
+      </w:pPr>
+      <w:r>
+        <w:rPr>
+          <w:rFonts w:hint="default"/>
+          <w:lang w:val="pt-BR"/>
+        </w:rPr>
+        <w:t>Questão</w:t>
+      </w:r>
+    </w:p>
+    <w:p>
+      <w:pPr>
+        <w:rPr>
+          <w:rFonts w:hint="default"/>
+          <w:lang w:val="pt-BR"/>
+        </w:rPr>
+      </w:pPr>
+      <w:r>
+        <w:rPr>
+          <w:rFonts w:hint="default"/>
+          <w:lang w:val="pt-BR"/>
+        </w:rPr>
+        <w:t>Aqui a lista de strings é ordenada de forma crescente ignorando maiúsculas e minúsculas pois por padrão as maiúsculas sempre têm precedência na ordenação.</w:t>
+      </w:r>
+    </w:p>
+    <w:p>
+      <w:pPr>
+        <w:rPr>
+          <w:rFonts w:hint="default"/>
+          <w:lang w:val="pt-BR"/>
+        </w:rPr>
+      </w:pPr>
+      <w:r>
+        <w:rPr>
+          <w:rFonts w:hint="default"/>
+          <w:lang w:val="pt-BR"/>
+        </w:rPr>
+        <w:t xml:space="preserve">O loop for externo percorre todos os itens da lista, já o loop for interno faz comparações entre elementos vizinhos. O if seguinte compara a palavra atual com a próxima usando </w:t>
+      </w:r>
+      <w:r>
+        <w:rPr>
+          <w:rFonts w:hint="default"/>
+          <w:b/>
+          <w:bCs/>
+          <w:lang w:val="pt-BR"/>
+        </w:rPr>
+        <w:t>.lower()</w:t>
+      </w:r>
+      <w:r>
+        <w:rPr>
+          <w:rFonts w:hint="default"/>
+          <w:lang w:val="pt-BR"/>
+        </w:rPr>
+        <w:t xml:space="preserve"> para ignorar diferenças entre maiúsculas e minúsculas.</w:t>
+      </w:r>
+    </w:p>
+    <w:p>
+      <w:pPr>
+        <w:rPr>
+          <w:rFonts w:hint="default"/>
+          <w:lang w:val="pt-BR"/>
+        </w:rPr>
+      </w:pPr>
+      <w:r>
+        <w:rPr>
+          <w:rFonts w:hint="default"/>
+          <w:lang w:val="pt-BR"/>
+        </w:rPr>
+        <w:t>Dentro do if, fazemos as trocas de posições e informamos em sequência que foi trocado pelo menos uma vez nessa passada.</w:t>
+      </w:r>
+    </w:p>
+    <w:p>
+      <w:pPr>
+        <w:rPr>
+          <w:rFonts w:hint="default"/>
+          <w:lang w:val="pt-BR"/>
+        </w:rPr>
+      </w:pPr>
+      <w:r>
+        <w:rPr>
+          <w:rFonts w:hint="default"/>
+          <w:lang w:val="pt-BR"/>
+        </w:rPr>
+        <w:t>O último if verifica se nenhuma troca foi realizada, caso isso ocorra, a lista já está ordenada e pode-se encerrar a aplicação antecipadamente.</w:t>
+      </w:r>
+    </w:p>
     <w:sectPr>
       <w:pgSz w:w="11906" w:h="16838"/>
       <w:pgMar w:top="851" w:right="851" w:bottom="851" w:left="851" w:header="709" w:footer="709" w:gutter="0"/>
@@ -4637,7 +5836,7 @@
   <w:footnote w:type="separator" w:id="0">
     <w:p>
       <w:pPr>
-        <w:spacing w:before="0" w:after="0" w:line="259" w:lineRule="auto"/>
+        <w:spacing w:before="0" w:after="0" w:line="260" w:lineRule="auto"/>
       </w:pPr>
       <w:r>
         <w:separator/>
@@ -4647,7 +5846,7 @@
   <w:footnote w:type="continuationSeparator" w:id="1">
     <w:p>
       <w:pPr>
-        <w:spacing w:before="0" w:after="0" w:line="259" w:lineRule="auto"/>
+        <w:spacing w:before="0" w:after="0" w:line="260" w:lineRule="auto"/>
       </w:pPr>
       <w:r>
         <w:continuationSeparator/>
@@ -4660,6 +5859,66 @@
 <file path=word/numbering.xml><?xml version="1.0" encoding="utf-8"?>
 <w:numbering xmlns:wpc="http://schemas.microsoft.com/office/word/2010/wordprocessingCanvas" xmlns:mc="http://schemas.openxmlformats.org/markup-compatibility/2006" xmlns:o="urn:schemas-microsoft-com:office:office" xmlns:r="http://schemas.openxmlformats.org/officeDocument/2006/relationships" xmlns:m="http://schemas.openxmlformats.org/officeDocument/2006/math" xmlns:v="urn:schemas-microsoft-com:vml" xmlns:wp14="http://schemas.microsoft.com/office/word/2010/wordprocessingDrawing" xmlns:wp="http://schemas.openxmlformats.org/drawingml/2006/wordprocessingDrawing" xmlns:w10="urn:schemas-microsoft-com:office:word" xmlns:w="http://schemas.openxmlformats.org/wordprocessingml/2006/main" xmlns:w14="http://schemas.microsoft.com/office/word/2010/wordml" xmlns:wpg="http://schemas.microsoft.com/office/word/2010/wordprocessingGroup" xmlns:wpi="http://schemas.microsoft.com/office/word/2010/wordprocessingInk" xmlns:wne="http://schemas.microsoft.com/office/word/2006/wordml" xmlns:wps="http://schemas.microsoft.com/office/word/2010/wordprocessingShape" xmlns:wpsCustomData="http://www.wps.cn/officeDocument/2013/wpsCustomData" mc:Ignorable="w14 wp14">
   <w:abstractNum w:abstractNumId="0">
+    <w:nsid w:val="9739615B"/>
+    <w:multiLevelType w:val="singleLevel"/>
+    <w:tmpl w:val="9739615B"/>
+    <w:lvl w:ilvl="0" w:tentative="0">
+      <w:start w:val="1"/>
+      <w:numFmt w:val="bullet"/>
+      <w:lvlText w:val=""/>
+      <w:lvlJc w:val="left"/>
+      <w:pPr>
+        <w:tabs>
+          <w:tab w:val="left" w:pos="420"/>
+        </w:tabs>
+        <w:ind w:left="420" w:leftChars="0" w:hanging="420" w:firstLineChars="0"/>
+      </w:pPr>
+      <w:rPr>
+        <w:rFonts w:hint="default" w:ascii="Wingdings" w:hAnsi="Wingdings"/>
+      </w:rPr>
+    </w:lvl>
+  </w:abstractNum>
+  <w:abstractNum w:abstractNumId="1">
+    <w:nsid w:val="5CF4D90C"/>
+    <w:multiLevelType w:val="singleLevel"/>
+    <w:tmpl w:val="5CF4D90C"/>
+    <w:lvl w:ilvl="0" w:tentative="0">
+      <w:start w:val="1"/>
+      <w:numFmt w:val="bullet"/>
+      <w:lvlText w:val=""/>
+      <w:lvlJc w:val="left"/>
+      <w:pPr>
+        <w:tabs>
+          <w:tab w:val="left" w:pos="420"/>
+        </w:tabs>
+        <w:ind w:left="420" w:leftChars="0" w:hanging="420" w:firstLineChars="0"/>
+      </w:pPr>
+      <w:rPr>
+        <w:rFonts w:hint="default" w:ascii="Wingdings" w:hAnsi="Wingdings"/>
+      </w:rPr>
+    </w:lvl>
+  </w:abstractNum>
+  <w:abstractNum w:abstractNumId="2">
+    <w:nsid w:val="5E56D730"/>
+    <w:multiLevelType w:val="singleLevel"/>
+    <w:tmpl w:val="5E56D730"/>
+    <w:lvl w:ilvl="0" w:tentative="0">
+      <w:start w:val="1"/>
+      <w:numFmt w:val="bullet"/>
+      <w:lvlText w:val=""/>
+      <w:lvlJc w:val="left"/>
+      <w:pPr>
+        <w:tabs>
+          <w:tab w:val="left" w:pos="420"/>
+        </w:tabs>
+        <w:ind w:left="420" w:leftChars="0" w:hanging="420" w:firstLineChars="0"/>
+      </w:pPr>
+      <w:rPr>
+        <w:rFonts w:hint="default" w:ascii="Wingdings" w:hAnsi="Wingdings"/>
+      </w:rPr>
+    </w:lvl>
+  </w:abstractNum>
+  <w:abstractNum w:abstractNumId="3">
     <w:nsid w:val="60585075"/>
     <w:multiLevelType w:val="multilevel"/>
     <w:tmpl w:val="60585075"/>
@@ -4749,8 +6008,40 @@
       </w:pPr>
     </w:lvl>
   </w:abstractNum>
+  <w:abstractNum w:abstractNumId="4">
+    <w:nsid w:val="7A024BAD"/>
+    <w:multiLevelType w:val="singleLevel"/>
+    <w:tmpl w:val="7A024BAD"/>
+    <w:lvl w:ilvl="0" w:tentative="0">
+      <w:start w:val="1"/>
+      <w:numFmt w:val="bullet"/>
+      <w:lvlText w:val=""/>
+      <w:lvlJc w:val="left"/>
+      <w:pPr>
+        <w:tabs>
+          <w:tab w:val="left" w:pos="420"/>
+        </w:tabs>
+        <w:ind w:left="420" w:leftChars="0" w:hanging="420" w:firstLineChars="0"/>
+      </w:pPr>
+      <w:rPr>
+        <w:rFonts w:hint="default" w:ascii="Wingdings" w:hAnsi="Wingdings"/>
+      </w:rPr>
+    </w:lvl>
+  </w:abstractNum>
   <w:num w:numId="1">
+    <w:abstractNumId w:val="3"/>
+  </w:num>
+  <w:num w:numId="2">
     <w:abstractNumId w:val="0"/>
+  </w:num>
+  <w:num w:numId="3">
+    <w:abstractNumId w:val="4"/>
+  </w:num>
+  <w:num w:numId="4">
+    <w:abstractNumId w:val="2"/>
+  </w:num>
+  <w:num w:numId="5">
+    <w:abstractNumId w:val="1"/>
   </w:num>
 </w:numbering>
 </file>
@@ -4862,7 +6153,7 @@
     <w:lsdException w:uiPriority="99" w:name="HTML Acronym"/>
     <w:lsdException w:uiPriority="99" w:name="HTML Address"/>
     <w:lsdException w:uiPriority="99" w:name="HTML Cite"/>
-    <w:lsdException w:uiPriority="99" w:name="HTML Code"/>
+    <w:lsdException w:qFormat="1" w:uiPriority="99" w:name="HTML Code"/>
     <w:lsdException w:uiPriority="99" w:name="HTML Definition"/>
     <w:lsdException w:uiPriority="99" w:name="HTML Keyboard"/>
     <w:lsdException w:qFormat="1" w:uiPriority="99" w:semiHidden="0" w:name="HTML Preformatted"/>
@@ -5022,10 +6313,10 @@
     <w:qFormat/>
     <w:uiPriority w:val="0"/>
     <w:pPr>
-      <w:spacing w:after="0" w:line="259" w:lineRule="auto"/>
+      <w:spacing w:after="50" w:afterLines="50" w:line="260" w:lineRule="auto"/>
     </w:pPr>
     <w:rPr>
-      <w:rFonts w:ascii="Arial" w:hAnsi="Arial" w:eastAsiaTheme="minorHAnsi" w:cstheme="minorBidi"/>
+      <w:rFonts w:ascii="Arial" w:hAnsi="Arial" w:eastAsiaTheme="minorEastAsia" w:cstheme="minorBidi"/>
       <w:sz w:val="24"/>
       <w:szCs w:val="22"/>
       <w:lang w:val="pt-BR" w:eastAsia="en-US" w:bidi="ar-SA"/>
@@ -5035,7 +6326,7 @@
     <w:name w:val="heading 1"/>
     <w:basedOn w:val="1"/>
     <w:next w:val="1"/>
-    <w:link w:val="16"/>
+    <w:link w:val="18"/>
     <w:qFormat/>
     <w:uiPriority w:val="9"/>
     <w:pPr>
@@ -5060,7 +6351,7 @@
     <w:name w:val="heading 2"/>
     <w:basedOn w:val="1"/>
     <w:next w:val="1"/>
-    <w:link w:val="18"/>
+    <w:link w:val="20"/>
     <w:unhideWhenUsed/>
     <w:qFormat/>
     <w:uiPriority w:val="9"/>
@@ -5081,7 +6372,7 @@
     <w:name w:val="heading 3"/>
     <w:basedOn w:val="1"/>
     <w:next w:val="1"/>
-    <w:link w:val="21"/>
+    <w:link w:val="23"/>
     <w:unhideWhenUsed/>
     <w:qFormat/>
     <w:uiPriority w:val="9"/>
@@ -5149,10 +6440,23 @@
       </w14:textFill>
     </w:rPr>
   </w:style>
-  <w:style w:type="paragraph" w:styleId="9">
+  <w:style w:type="character" w:styleId="9">
+    <w:name w:val="HTML Code"/>
+    <w:basedOn w:val="5"/>
+    <w:semiHidden/>
+    <w:unhideWhenUsed/>
+    <w:qFormat/>
+    <w:uiPriority w:val="99"/>
+    <w:rPr>
+      <w:rFonts w:ascii="Courier New" w:hAnsi="Courier New" w:cs="Courier New"/>
+      <w:sz w:val="20"/>
+      <w:szCs w:val="20"/>
+    </w:rPr>
+  </w:style>
+  <w:style w:type="paragraph" w:styleId="10">
     <w:name w:val="HTML Preformatted"/>
     <w:basedOn w:val="1"/>
-    <w:link w:val="24"/>
+    <w:link w:val="26"/>
     <w:unhideWhenUsed/>
     <w:qFormat/>
     <w:uiPriority w:val="99"/>
@@ -5184,7 +6488,7 @@
       <w:lang w:val="en-US"/>
     </w:rPr>
   </w:style>
-  <w:style w:type="character" w:styleId="10">
+  <w:style w:type="character" w:styleId="11">
     <w:name w:val="Hyperlink"/>
     <w:basedOn w:val="5"/>
     <w:unhideWhenUsed/>
@@ -5200,7 +6504,25 @@
       </w14:textFill>
     </w:rPr>
   </w:style>
-  <w:style w:type="character" w:styleId="11">
+  <w:style w:type="paragraph" w:styleId="12">
+    <w:name w:val="Normal (Web)"/>
+    <w:semiHidden/>
+    <w:unhideWhenUsed/>
+    <w:uiPriority w:val="99"/>
+    <w:pPr>
+      <w:spacing w:before="0" w:beforeAutospacing="1" w:after="0" w:afterAutospacing="1"/>
+      <w:ind w:left="0" w:right="0"/>
+      <w:jc w:val="left"/>
+    </w:pPr>
+    <w:rPr>
+      <w:rFonts w:ascii="Times New Roman" w:hAnsi="Times New Roman" w:eastAsia="SimSun" w:cs="Times New Roman"/>
+      <w:kern w:val="0"/>
+      <w:sz w:val="24"/>
+      <w:szCs w:val="24"/>
+      <w:lang w:val="en-US" w:eastAsia="zh-CN" w:bidi="ar"/>
+    </w:rPr>
+  </w:style>
+  <w:style w:type="character" w:styleId="13">
     <w:name w:val="Strong"/>
     <w:basedOn w:val="5"/>
     <w:qFormat/>
@@ -5210,7 +6532,7 @@
       <w:bCs/>
     </w:rPr>
   </w:style>
-  <w:style w:type="table" w:styleId="12">
+  <w:style w:type="table" w:styleId="14">
     <w:name w:val="Table Grid"/>
     <w:basedOn w:val="6"/>
     <w:qFormat/>
@@ -5229,11 +6551,11 @@
       </w:tblBorders>
     </w:tblPr>
   </w:style>
-  <w:style w:type="paragraph" w:styleId="13">
+  <w:style w:type="paragraph" w:styleId="15">
     <w:name w:val="Title"/>
     <w:basedOn w:val="1"/>
     <w:next w:val="1"/>
-    <w:link w:val="15"/>
+    <w:link w:val="17"/>
     <w:qFormat/>
     <w:uiPriority w:val="10"/>
     <w:pPr>
@@ -5250,7 +6572,7 @@
       <w:szCs w:val="56"/>
     </w:rPr>
   </w:style>
-  <w:style w:type="paragraph" w:styleId="14">
+  <w:style w:type="paragraph" w:styleId="16">
     <w:name w:val="List Paragraph"/>
     <w:basedOn w:val="1"/>
     <w:qFormat/>
@@ -5260,10 +6582,10 @@
       <w:contextualSpacing/>
     </w:pPr>
   </w:style>
-  <w:style w:type="character" w:customStyle="1" w:styleId="15">
+  <w:style w:type="character" w:customStyle="1" w:styleId="17">
     <w:name w:val="Título Char"/>
     <w:basedOn w:val="5"/>
-    <w:link w:val="13"/>
+    <w:link w:val="15"/>
     <w:qFormat/>
     <w:uiPriority w:val="10"/>
     <w:rPr>
@@ -5275,7 +6597,7 @@
       <w:szCs w:val="56"/>
     </w:rPr>
   </w:style>
-  <w:style w:type="character" w:customStyle="1" w:styleId="16">
+  <w:style w:type="character" w:customStyle="1" w:styleId="18">
     <w:name w:val="Título 1 Char"/>
     <w:basedOn w:val="5"/>
     <w:link w:val="2"/>
@@ -5289,7 +6611,7 @@
       <w:szCs w:val="32"/>
     </w:rPr>
   </w:style>
-  <w:style w:type="character" w:customStyle="1" w:styleId="17">
+  <w:style w:type="character" w:customStyle="1" w:styleId="19">
     <w:name w:val="Unresolved Mention"/>
     <w:basedOn w:val="5"/>
     <w:semiHidden/>
@@ -5301,7 +6623,7 @@
       <w:shd w:val="clear" w:color="auto" w:fill="E1DFDD"/>
     </w:rPr>
   </w:style>
-  <w:style w:type="character" w:customStyle="1" w:styleId="18">
+  <w:style w:type="character" w:customStyle="1" w:styleId="20">
     <w:name w:val="Título 2 Char"/>
     <w:basedOn w:val="5"/>
     <w:link w:val="3"/>
@@ -5314,9 +6636,9 @@
       <w:szCs w:val="26"/>
     </w:rPr>
   </w:style>
-  <w:style w:type="paragraph" w:styleId="19">
+  <w:style w:type="paragraph" w:styleId="21">
     <w:name w:val="No Spacing"/>
-    <w:link w:val="20"/>
+    <w:link w:val="22"/>
     <w:qFormat/>
     <w:uiPriority w:val="1"/>
     <w:pPr>
@@ -5329,10 +6651,10 @@
       <w:lang w:val="pt-BR" w:eastAsia="pt-BR" w:bidi="ar-SA"/>
     </w:rPr>
   </w:style>
-  <w:style w:type="character" w:customStyle="1" w:styleId="20">
+  <w:style w:type="character" w:customStyle="1" w:styleId="22">
     <w:name w:val="Sem Espaçamento Char"/>
     <w:basedOn w:val="5"/>
-    <w:link w:val="19"/>
+    <w:link w:val="21"/>
     <w:qFormat/>
     <w:uiPriority w:val="1"/>
     <w:rPr>
@@ -5340,7 +6662,7 @@
       <w:lang w:eastAsia="pt-BR"/>
     </w:rPr>
   </w:style>
-  <w:style w:type="character" w:customStyle="1" w:styleId="21">
+  <w:style w:type="character" w:customStyle="1" w:styleId="23">
     <w:name w:val="Título 3 Char"/>
     <w:basedOn w:val="5"/>
     <w:link w:val="4"/>
@@ -5353,10 +6675,10 @@
       <w:szCs w:val="24"/>
     </w:rPr>
   </w:style>
-  <w:style w:type="paragraph" w:customStyle="1" w:styleId="22">
+  <w:style w:type="paragraph" w:customStyle="1" w:styleId="24">
     <w:name w:val="Imagem"/>
     <w:basedOn w:val="1"/>
-    <w:link w:val="23"/>
+    <w:link w:val="25"/>
     <w:qFormat/>
     <w:uiPriority w:val="0"/>
     <w:pPr>
@@ -5364,17 +6686,17 @@
       <w:jc w:val="center"/>
     </w:pPr>
   </w:style>
-  <w:style w:type="character" w:customStyle="1" w:styleId="23">
+  <w:style w:type="character" w:customStyle="1" w:styleId="25">
     <w:name w:val="Imagem Char"/>
     <w:basedOn w:val="5"/>
-    <w:link w:val="22"/>
+    <w:link w:val="24"/>
     <w:qFormat/>
     <w:uiPriority w:val="0"/>
   </w:style>
-  <w:style w:type="character" w:customStyle="1" w:styleId="24">
+  <w:style w:type="character" w:customStyle="1" w:styleId="26">
     <w:name w:val="Pré-formatação HTML Char"/>
     <w:basedOn w:val="5"/>
-    <w:link w:val="9"/>
+    <w:link w:val="10"/>
     <w:qFormat/>
     <w:uiPriority w:val="99"/>
     <w:rPr>
@@ -5644,7 +6966,9 @@
 
 <file path=customXml/item1.xml><?xml version="1.0" encoding="utf-8"?>
 <s:customData xmlns="http://www.wps.cn/officeDocument/2013/wpsCustomData" xmlns:s="http://www.wps.cn/officeDocument/2013/wpsCustomData">
-  <customSectProps/>
+  <customSectProps>
+    <customSectPr/>
+  </customSectProps>
   <customShpExts>
     <customShpInfo spid="_x0000_s1026" textRotate="1"/>
   </customShpExts>
@@ -5652,10 +6976,6 @@
 </file>
 
 <file path=customXml/item2.xml><?xml version="1.0" encoding="utf-8"?>
-<b:Sources xmlns:b="http://schemas.openxmlformats.org/officeDocument/2006/bibliography" xmlns="http://schemas.openxmlformats.org/officeDocument/2006/bibliography" SelectedStyle="\APASixthEditionOfficeOnline.xsl" StyleName="APA" Version="6"/>
-</file>
-
-<file path=customXml/item3.xml><?xml version="1.0" encoding="utf-8"?>
 <CoverPageProperties xmlns="http://schemas.microsoft.com/office/2006/coverPageProps">
   <PublishDate>2025-08-11T00:00:00</PublishDate>
   <Abstract/>
@@ -5664,6 +6984,10 @@
   <CompanyFax/>
   <CompanyEmail/>
 </CoverPageProperties>
+</file>
+
+<file path=customXml/item3.xml><?xml version="1.0" encoding="utf-8"?>
+<b:Sources xmlns:b="http://schemas.openxmlformats.org/officeDocument/2006/bibliography" xmlns="http://schemas.openxmlformats.org/officeDocument/2006/bibliography" SelectedStyle="\APASixthEditionOfficeOnline.xsl" StyleName="APA" Version="6"/>
 </file>
 
 <file path=customXml/itemProps1.xml><?xml version="1.0" encoding="utf-8"?>
@@ -5675,13 +6999,13 @@
 </file>
 
 <file path=customXml/itemProps2.xml><?xml version="1.0" encoding="utf-8"?>
-<ds:datastoreItem xmlns:ds="http://schemas.openxmlformats.org/officeDocument/2006/customXml" ds:itemID="{38D82A8E-633C-4282-BEE8-A7D3FC9615F2}">
+<ds:datastoreItem xmlns:ds="http://schemas.openxmlformats.org/officeDocument/2006/customXml" ds:itemID="{55AF091B-3C7A-41E3-B477-F2FDAA23CFDA}">
   <ds:schemaRefs/>
 </ds:datastoreItem>
 </file>
 
 <file path=customXml/itemProps3.xml><?xml version="1.0" encoding="utf-8"?>
-<ds:datastoreItem xmlns:ds="http://schemas.openxmlformats.org/officeDocument/2006/customXml" ds:itemID="{55AF091B-3C7A-41E3-B477-F2FDAA23CFDA}">
+<ds:datastoreItem xmlns:ds="http://schemas.openxmlformats.org/officeDocument/2006/customXml" ds:itemID="{38D82A8E-633C-4282-BEE8-A7D3FC9615F2}">
   <ds:schemaRefs/>
 </ds:datastoreItem>
 </file>
</xml_diff>

<commit_message>
feat: TP1 Add a Python file with all the solved questions in a single file.
</commit_message>
<xml_diff>
--- a/TP1/documentos/samuel_hermany_DR1_TP1.docx
+++ b/TP1/documentos/samuel_hermany_DR1_TP1.docx
@@ -4465,6 +4465,7 @@
       <w:pPr>
         <w:pStyle w:val="2"/>
         <w:numPr>
+          <w:ilvl w:val="0"/>
           <w:numId w:val="0"/>
         </w:numPr>
         <w:ind w:left="720" w:leftChars="0"/>
@@ -4517,6 +4518,56 @@
           <w:rFonts w:hint="default"/>
         </w:rPr>
         <w:fldChar w:fldCharType="end"/>
+      </w:r>
+    </w:p>
+    <w:p>
+      <w:pPr>
+        <w:rPr>
+          <w:rFonts w:hint="default"/>
+          <w:lang w:val="pt-BR"/>
+        </w:rPr>
+      </w:pPr>
+      <w:r>
+        <w:rPr>
+          <w:rFonts w:hint="default"/>
+          <w:b/>
+          <w:bCs/>
+          <w:color w:val="C00000"/>
+          <w:lang w:val="pt-BR"/>
+        </w:rPr>
+        <w:t>Obs. No GitHub consta além de um arquivo co</w:t>
+      </w:r>
+      <w:bookmarkStart w:id="0" w:name="_GoBack"/>
+      <w:bookmarkEnd w:id="0"/>
+      <w:r>
+        <w:rPr>
+          <w:rFonts w:hint="default"/>
+          <w:b/>
+          <w:bCs/>
+          <w:color w:val="C00000"/>
+          <w:lang w:val="pt-BR"/>
+        </w:rPr>
+        <w:t>m código de cada questão, tem um outro com todas as questões e ordem, acredito que seja mais fácil para corrigir.</w:t>
+      </w:r>
+      <w:r>
+        <w:rPr>
+          <w:rFonts w:hint="default"/>
+          <w:b/>
+          <w:bCs/>
+          <w:color w:val="C00000"/>
+          <w:lang w:val="pt-BR"/>
+        </w:rPr>
+        <w:br w:type="textWrapping"/>
+      </w:r>
+      <w:r>
+        <w:rPr>
+          <w:rFonts w:hint="default"/>
+          <w:b/>
+          <w:bCs/>
+          <w:color w:val="C00000"/>
+          <w:lang w:val="pt-BR"/>
+        </w:rPr>
+        <w:t>tp1-todos-exercicios</w:t>
       </w:r>
     </w:p>
     <w:p>
@@ -5235,14 +5286,6 @@
         </w:rPr>
         <w:fldChar w:fldCharType="end"/>
       </w:r>
-    </w:p>
-    <w:p>
-      <w:pPr>
-        <w:rPr>
-          <w:rFonts w:hint="default"/>
-          <w:lang w:val="pt-BR"/>
-        </w:rPr>
-      </w:pPr>
     </w:p>
     <w:p>
       <w:pPr>
@@ -5356,8 +5399,6 @@
           <w:lang w:val="pt-BR"/>
         </w:rPr>
       </w:pPr>
-      <w:bookmarkStart w:id="0" w:name="_GoBack"/>
-      <w:bookmarkEnd w:id="0"/>
     </w:p>
     <w:p>
       <w:pPr>
@@ -6976,6 +7017,10 @@
 </file>
 
 <file path=customXml/item2.xml><?xml version="1.0" encoding="utf-8"?>
+<b:Sources xmlns:b="http://schemas.openxmlformats.org/officeDocument/2006/bibliography" xmlns="http://schemas.openxmlformats.org/officeDocument/2006/bibliography" SelectedStyle="\APASixthEditionOfficeOnline.xsl" StyleName="APA" Version="6"/>
+</file>
+
+<file path=customXml/item3.xml><?xml version="1.0" encoding="utf-8"?>
 <CoverPageProperties xmlns="http://schemas.microsoft.com/office/2006/coverPageProps">
   <PublishDate>2025-08-11T00:00:00</PublishDate>
   <Abstract/>
@@ -6984,10 +7029,6 @@
   <CompanyFax/>
   <CompanyEmail/>
 </CoverPageProperties>
-</file>
-
-<file path=customXml/item3.xml><?xml version="1.0" encoding="utf-8"?>
-<b:Sources xmlns:b="http://schemas.openxmlformats.org/officeDocument/2006/bibliography" xmlns="http://schemas.openxmlformats.org/officeDocument/2006/bibliography" SelectedStyle="\APASixthEditionOfficeOnline.xsl" StyleName="APA" Version="6"/>
 </file>
 
 <file path=customXml/itemProps1.xml><?xml version="1.0" encoding="utf-8"?>
@@ -6999,13 +7040,13 @@
 </file>
 
 <file path=customXml/itemProps2.xml><?xml version="1.0" encoding="utf-8"?>
-<ds:datastoreItem xmlns:ds="http://schemas.openxmlformats.org/officeDocument/2006/customXml" ds:itemID="{55AF091B-3C7A-41E3-B477-F2FDAA23CFDA}">
+<ds:datastoreItem xmlns:ds="http://schemas.openxmlformats.org/officeDocument/2006/customXml" ds:itemID="{38D82A8E-633C-4282-BEE8-A7D3FC9615F2}">
   <ds:schemaRefs/>
 </ds:datastoreItem>
 </file>
 
 <file path=customXml/itemProps3.xml><?xml version="1.0" encoding="utf-8"?>
-<ds:datastoreItem xmlns:ds="http://schemas.openxmlformats.org/officeDocument/2006/customXml" ds:itemID="{38D82A8E-633C-4282-BEE8-A7D3FC9615F2}">
+<ds:datastoreItem xmlns:ds="http://schemas.openxmlformats.org/officeDocument/2006/customXml" ds:itemID="{55AF091B-3C7A-41E3-B477-F2FDAA23CFDA}">
   <ds:schemaRefs/>
 </ds:datastoreItem>
 </file>
</xml_diff>